<commit_message>
updated module 2 task checklist
</commit_message>
<xml_diff>
--- a/Module_2_Oct_2026/Module2_task_checklist.docx
+++ b/Module_2_Oct_2026/Module2_task_checklist.docx
@@ -43,17 +43,7 @@
           <w:sz w:val="18"/>
           <w:szCs w:val="18"/>
         </w:rPr>
-        <w:t>☑</w:t>
-      </w:r>
-      <w:r>
-        <w:rPr>
-          <w:i/>
-          <w:iCs/>
-          <w:color w:val="5C6467"/>
-          <w:sz w:val="18"/>
-          <w:szCs w:val="18"/>
-        </w:rPr>
-        <w:t xml:space="preserve"> = done   ☐ = to do.  Tags show who owns each task.</w:t>
+        <w:t>☑ = done   ☐ = to do.  Tags show who owns each task.</w:t>
       </w:r>
     </w:p>
     <w:tbl>
@@ -76,12 +66,6 @@
         <w:gridCol w:w="2800"/>
       </w:tblGrid>
       <w:tr>
-        <w:tblPrEx>
-          <w:tblCellMar>
-            <w:top w:w="0" w:type="dxa"/>
-            <w:bottom w:w="0" w:type="dxa"/>
-          </w:tblCellMar>
-        </w:tblPrEx>
         <w:tc>
           <w:tcPr>
             <w:tcW w:w="2340" w:type="dxa"/>
@@ -174,12 +158,6 @@
         </w:tc>
       </w:tr>
       <w:tr>
-        <w:tblPrEx>
-          <w:tblCellMar>
-            <w:top w:w="0" w:type="dxa"/>
-            <w:bottom w:w="0" w:type="dxa"/>
-          </w:tblCellMar>
-        </w:tblPrEx>
         <w:tc>
           <w:tcPr>
             <w:tcW w:w="2340" w:type="dxa"/>
@@ -286,15 +264,7 @@
           <w:sz w:val="24"/>
           <w:szCs w:val="24"/>
         </w:rPr>
-        <w:t>☐</w:t>
-      </w:r>
-      <w:r>
-        <w:rPr>
-          <w:color w:val="131516"/>
-          <w:sz w:val="24"/>
-          <w:szCs w:val="24"/>
-        </w:rPr>
-        <w:t xml:space="preserve">  </w:t>
+        <w:t xml:space="preserve">☐  </w:t>
       </w:r>
       <w:r>
         <w:rPr>
@@ -330,15 +300,7 @@
           <w:sz w:val="24"/>
           <w:szCs w:val="24"/>
         </w:rPr>
-        <w:t>☐</w:t>
-      </w:r>
-      <w:r>
-        <w:rPr>
-          <w:color w:val="131516"/>
-          <w:sz w:val="24"/>
-          <w:szCs w:val="24"/>
-        </w:rPr>
-        <w:t xml:space="preserve">  </w:t>
+        <w:t xml:space="preserve">☐  </w:t>
       </w:r>
       <w:r>
         <w:rPr>
@@ -360,7 +322,7 @@
           <w:sz w:val="21"/>
           <w:szCs w:val="21"/>
         </w:rPr>
-        <w:t>Ask Claude whether there is anything else for me to resolve / any other placeholders outstanding</w:t>
+        <w:t>Think about ways to incorporate our "AI for IE" slides (and exercises, if we have any)</w:t>
       </w:r>
     </w:p>
     <w:p>
@@ -374,59 +336,7 @@
           <w:sz w:val="24"/>
           <w:szCs w:val="24"/>
         </w:rPr>
-        <w:t>☐</w:t>
-      </w:r>
-      <w:r>
-        <w:rPr>
-          <w:color w:val="131516"/>
-          <w:sz w:val="24"/>
-          <w:szCs w:val="24"/>
-        </w:rPr>
-        <w:t xml:space="preserve">  </w:t>
-      </w:r>
-      <w:r>
-        <w:rPr>
-          <w:b/>
-          <w:bCs/>
-          <w:color w:val="FFFFFF"/>
-          <w:sz w:val="15"/>
-          <w:szCs w:val="15"/>
-          <w:shd w:val="clear" w:color="auto" w:fill="9A2515"/>
-        </w:rPr>
-        <w:t xml:space="preserve"> FK </w:t>
-      </w:r>
-      <w:r>
-        <w:t xml:space="preserve">  </w:t>
-      </w:r>
-      <w:r>
-        <w:rPr>
-          <w:color w:val="131516"/>
-          <w:sz w:val="21"/>
-          <w:szCs w:val="21"/>
-        </w:rPr>
-        <w:t>Think about ways to incorporate our "AI for IE" slides (and exercises, if we have any)</w:t>
-      </w:r>
-    </w:p>
-    <w:p>
-      <w:pPr>
-        <w:spacing w:after="60"/>
-        <w:ind w:left="360" w:hanging="300"/>
-      </w:pPr>
-      <w:r>
-        <w:rPr>
-          <w:color w:val="131516"/>
-          <w:sz w:val="24"/>
-          <w:szCs w:val="24"/>
-        </w:rPr>
-        <w:t>☐</w:t>
-      </w:r>
-      <w:r>
-        <w:rPr>
-          <w:color w:val="131516"/>
-          <w:sz w:val="24"/>
-          <w:szCs w:val="24"/>
-        </w:rPr>
-        <w:t xml:space="preserve">  </w:t>
+        <w:t xml:space="preserve">☐  </w:t>
       </w:r>
       <w:r>
         <w:rPr>
@@ -499,15 +409,7 @@
           <w:sz w:val="24"/>
           <w:szCs w:val="24"/>
         </w:rPr>
-        <w:t>☑</w:t>
-      </w:r>
-      <w:r>
-        <w:rPr>
-          <w:color w:val="1E7A46"/>
-          <w:sz w:val="24"/>
-          <w:szCs w:val="24"/>
-        </w:rPr>
-        <w:t xml:space="preserve">  </w:t>
+        <w:t xml:space="preserve">☑  </w:t>
       </w:r>
       <w:r>
         <w:rPr>
@@ -543,15 +445,7 @@
           <w:sz w:val="24"/>
           <w:szCs w:val="24"/>
         </w:rPr>
-        <w:t>☐</w:t>
-      </w:r>
-      <w:r>
-        <w:rPr>
-          <w:color w:val="131516"/>
-          <w:sz w:val="24"/>
-          <w:szCs w:val="24"/>
-        </w:rPr>
-        <w:t xml:space="preserve">  </w:t>
+        <w:t xml:space="preserve">☐  </w:t>
       </w:r>
       <w:r>
         <w:rPr>
@@ -609,15 +503,7 @@
           <w:sz w:val="24"/>
           <w:szCs w:val="24"/>
         </w:rPr>
-        <w:t>☐</w:t>
-      </w:r>
-      <w:r>
-        <w:rPr>
-          <w:color w:val="131516"/>
-          <w:sz w:val="24"/>
-          <w:szCs w:val="24"/>
-        </w:rPr>
-        <w:t xml:space="preserve">  </w:t>
+        <w:t xml:space="preserve">☐  </w:t>
       </w:r>
       <w:r>
         <w:rPr>
@@ -671,15 +557,7 @@
           <w:sz w:val="24"/>
           <w:szCs w:val="24"/>
         </w:rPr>
-        <w:t>☑</w:t>
-      </w:r>
-      <w:r>
-        <w:rPr>
-          <w:color w:val="1E7A46"/>
-          <w:sz w:val="24"/>
-          <w:szCs w:val="24"/>
-        </w:rPr>
-        <w:t xml:space="preserve">  </w:t>
+        <w:t xml:space="preserve">☑  </w:t>
       </w:r>
       <w:r>
         <w:rPr>
@@ -715,15 +593,7 @@
           <w:sz w:val="24"/>
           <w:szCs w:val="24"/>
         </w:rPr>
-        <w:t>☐</w:t>
-      </w:r>
-      <w:r>
-        <w:rPr>
-          <w:color w:val="131516"/>
-          <w:sz w:val="24"/>
-          <w:szCs w:val="24"/>
-        </w:rPr>
-        <w:t xml:space="preserve">  </w:t>
+        <w:t xml:space="preserve">☐  </w:t>
       </w:r>
       <w:r>
         <w:rPr>
@@ -759,15 +629,7 @@
           <w:sz w:val="24"/>
           <w:szCs w:val="24"/>
         </w:rPr>
-        <w:t>☐</w:t>
-      </w:r>
-      <w:r>
-        <w:rPr>
-          <w:color w:val="131516"/>
-          <w:sz w:val="24"/>
-          <w:szCs w:val="24"/>
-        </w:rPr>
-        <w:t xml:space="preserve">  </w:t>
+        <w:t xml:space="preserve">☐  </w:t>
       </w:r>
       <w:r>
         <w:rPr>
@@ -840,15 +702,7 @@
           <w:sz w:val="24"/>
           <w:szCs w:val="24"/>
         </w:rPr>
-        <w:t>☑</w:t>
-      </w:r>
-      <w:r>
-        <w:rPr>
-          <w:color w:val="1E7A46"/>
-          <w:sz w:val="24"/>
-          <w:szCs w:val="24"/>
-        </w:rPr>
-        <w:t xml:space="preserve">  </w:t>
+        <w:t xml:space="preserve">☑  </w:t>
       </w:r>
       <w:r>
         <w:rPr>
@@ -884,15 +738,7 @@
           <w:sz w:val="24"/>
           <w:szCs w:val="24"/>
         </w:rPr>
-        <w:t>☐</w:t>
-      </w:r>
-      <w:r>
-        <w:rPr>
-          <w:color w:val="131516"/>
-          <w:sz w:val="24"/>
-          <w:szCs w:val="24"/>
-        </w:rPr>
-        <w:t xml:space="preserve">  </w:t>
+        <w:t xml:space="preserve">☐  </w:t>
       </w:r>
       <w:r>
         <w:rPr>
@@ -928,15 +774,7 @@
           <w:sz w:val="24"/>
           <w:szCs w:val="24"/>
         </w:rPr>
-        <w:t>☐</w:t>
-      </w:r>
-      <w:r>
-        <w:rPr>
-          <w:color w:val="131516"/>
-          <w:sz w:val="24"/>
-          <w:szCs w:val="24"/>
-        </w:rPr>
-        <w:t xml:space="preserve">  </w:t>
+        <w:t xml:space="preserve">☐  </w:t>
       </w:r>
       <w:r>
         <w:rPr>
@@ -972,15 +810,7 @@
           <w:sz w:val="24"/>
           <w:szCs w:val="24"/>
         </w:rPr>
-        <w:t>☐</w:t>
-      </w:r>
-      <w:r>
-        <w:rPr>
-          <w:color w:val="131516"/>
-          <w:sz w:val="24"/>
-          <w:szCs w:val="24"/>
-        </w:rPr>
-        <w:t xml:space="preserve">  </w:t>
+        <w:t xml:space="preserve">☐  </w:t>
       </w:r>
       <w:r>
         <w:rPr>
@@ -1034,15 +864,7 @@
           <w:sz w:val="24"/>
           <w:szCs w:val="24"/>
         </w:rPr>
-        <w:t>☐</w:t>
-      </w:r>
-      <w:r>
-        <w:rPr>
-          <w:color w:val="131516"/>
-          <w:sz w:val="24"/>
-          <w:szCs w:val="24"/>
-        </w:rPr>
-        <w:t xml:space="preserve">  </w:t>
+        <w:t xml:space="preserve">☐  </w:t>
       </w:r>
       <w:r>
         <w:rPr>
@@ -1092,15 +914,7 @@
           <w:sz w:val="24"/>
           <w:szCs w:val="24"/>
         </w:rPr>
-        <w:t>☐</w:t>
-      </w:r>
-      <w:r>
-        <w:rPr>
-          <w:color w:val="131516"/>
-          <w:sz w:val="24"/>
-          <w:szCs w:val="24"/>
-        </w:rPr>
-        <w:t xml:space="preserve">  </w:t>
+        <w:t xml:space="preserve">☐  </w:t>
       </w:r>
       <w:r>
         <w:rPr>
@@ -1154,15 +968,7 @@
           <w:sz w:val="24"/>
           <w:szCs w:val="24"/>
         </w:rPr>
-        <w:t>☐</w:t>
-      </w:r>
-      <w:r>
-        <w:rPr>
-          <w:color w:val="131516"/>
-          <w:sz w:val="24"/>
-          <w:szCs w:val="24"/>
-        </w:rPr>
-        <w:t xml:space="preserve">  </w:t>
+        <w:t xml:space="preserve">☐  </w:t>
       </w:r>
       <w:r>
         <w:rPr>
@@ -1198,15 +1004,7 @@
           <w:sz w:val="24"/>
           <w:szCs w:val="24"/>
         </w:rPr>
-        <w:t>☐</w:t>
-      </w:r>
-      <w:r>
-        <w:rPr>
-          <w:color w:val="131516"/>
-          <w:sz w:val="24"/>
-          <w:szCs w:val="24"/>
-        </w:rPr>
-        <w:t xml:space="preserve">  </w:t>
+        <w:t xml:space="preserve">☐  </w:t>
       </w:r>
       <w:r>
         <w:rPr>
@@ -1280,15 +1078,7 @@
           <w:sz w:val="24"/>
           <w:szCs w:val="24"/>
         </w:rPr>
-        <w:t>☐</w:t>
-      </w:r>
-      <w:r>
-        <w:rPr>
-          <w:color w:val="131516"/>
-          <w:sz w:val="24"/>
-          <w:szCs w:val="24"/>
-        </w:rPr>
-        <w:t xml:space="preserve">  </w:t>
+        <w:t xml:space="preserve">☐  </w:t>
       </w:r>
       <w:r>
         <w:rPr>
@@ -1342,15 +1132,7 @@
           <w:sz w:val="24"/>
           <w:szCs w:val="24"/>
         </w:rPr>
-        <w:t>☐</w:t>
-      </w:r>
-      <w:r>
-        <w:rPr>
-          <w:color w:val="131516"/>
-          <w:sz w:val="24"/>
-          <w:szCs w:val="24"/>
-        </w:rPr>
-        <w:t xml:space="preserve">  </w:t>
+        <w:t xml:space="preserve">☐  </w:t>
       </w:r>
       <w:r>
         <w:rPr>
@@ -1386,15 +1168,7 @@
           <w:sz w:val="24"/>
           <w:szCs w:val="24"/>
         </w:rPr>
-        <w:t>☐</w:t>
-      </w:r>
-      <w:r>
-        <w:rPr>
-          <w:color w:val="131516"/>
-          <w:sz w:val="24"/>
-          <w:szCs w:val="24"/>
-        </w:rPr>
-        <w:t xml:space="preserve">  </w:t>
+        <w:t xml:space="preserve">☐  </w:t>
       </w:r>
       <w:r>
         <w:rPr>
@@ -1483,47 +1257,7 @@
           <w:sz w:val="21"/>
           <w:szCs w:val="21"/>
         </w:rPr>
-        <w:t xml:space="preserve"> - d</w:t>
-      </w:r>
-      <w:r>
-        <w:rPr>
-          <w:color w:val="131516"/>
-          <w:sz w:val="21"/>
-          <w:szCs w:val="21"/>
-        </w:rPr>
-        <w:t>o we have a</w:t>
-      </w:r>
-      <w:r>
-        <w:rPr>
-          <w:color w:val="131516"/>
-          <w:sz w:val="21"/>
-          <w:szCs w:val="21"/>
-        </w:rPr>
-        <w:t>n existing</w:t>
-      </w:r>
-      <w:r>
-        <w:rPr>
-          <w:color w:val="131516"/>
-          <w:sz w:val="21"/>
-          <w:szCs w:val="21"/>
-        </w:rPr>
-        <w:t xml:space="preserve"> QA checklist</w:t>
-      </w:r>
-      <w:r>
-        <w:rPr>
-          <w:color w:val="131516"/>
-          <w:sz w:val="21"/>
-          <w:szCs w:val="21"/>
-        </w:rPr>
-        <w:t xml:space="preserve"> in mind</w:t>
-      </w:r>
-      <w:r>
-        <w:rPr>
-          <w:color w:val="131516"/>
-          <w:sz w:val="21"/>
-          <w:szCs w:val="21"/>
-        </w:rPr>
-        <w:t>?</w:t>
+        <w:t xml:space="preserve"> - do we have an existing QA checklist in mind?</w:t>
       </w:r>
     </w:p>
     <w:p>
@@ -1537,15 +1271,7 @@
           <w:sz w:val="24"/>
           <w:szCs w:val="24"/>
         </w:rPr>
-        <w:t>☐</w:t>
-      </w:r>
-      <w:r>
-        <w:rPr>
-          <w:color w:val="131516"/>
-          <w:sz w:val="24"/>
-          <w:szCs w:val="24"/>
-        </w:rPr>
-        <w:t xml:space="preserve">  </w:t>
+        <w:t xml:space="preserve">☐  </w:t>
       </w:r>
       <w:r>
         <w:rPr>
@@ -1575,15 +1301,7 @@
           <w:sz w:val="21"/>
           <w:szCs w:val="21"/>
         </w:rPr>
-        <w:t xml:space="preserve"> my notes </w:t>
-      </w:r>
-      <w:r>
-        <w:rPr>
-          <w:color w:val="131516"/>
-          <w:sz w:val="21"/>
-          <w:szCs w:val="21"/>
-        </w:rPr>
-        <w:t xml:space="preserve">for </w:t>
+        <w:t xml:space="preserve"> my notes for </w:t>
       </w:r>
       <w:r>
         <w:rPr>
@@ -1613,15 +1331,7 @@
           <w:sz w:val="24"/>
           <w:szCs w:val="24"/>
         </w:rPr>
-        <w:t>☐</w:t>
-      </w:r>
-      <w:r>
-        <w:rPr>
-          <w:color w:val="131516"/>
-          <w:sz w:val="24"/>
-          <w:szCs w:val="24"/>
-        </w:rPr>
-        <w:t xml:space="preserve">  </w:t>
+        <w:t xml:space="preserve">☐  </w:t>
       </w:r>
       <w:r>
         <w:rPr>
@@ -1702,15 +1412,7 @@
           <w:sz w:val="24"/>
           <w:szCs w:val="24"/>
         </w:rPr>
-        <w:t>☐</w:t>
-      </w:r>
-      <w:r>
-        <w:rPr>
-          <w:color w:val="131516"/>
-          <w:sz w:val="24"/>
-          <w:szCs w:val="24"/>
-        </w:rPr>
-        <w:t xml:space="preserve">  </w:t>
+        <w:t xml:space="preserve">☐  </w:t>
       </w:r>
       <w:r>
         <w:rPr>
@@ -1764,15 +1466,7 @@
           <w:sz w:val="24"/>
           <w:szCs w:val="24"/>
         </w:rPr>
-        <w:t>☐</w:t>
-      </w:r>
-      <w:r>
-        <w:rPr>
-          <w:color w:val="131516"/>
-          <w:sz w:val="24"/>
-          <w:szCs w:val="24"/>
-        </w:rPr>
-        <w:t xml:space="preserve">  </w:t>
+        <w:t xml:space="preserve">☐  </w:t>
       </w:r>
       <w:r>
         <w:rPr>
@@ -1808,15 +1502,7 @@
           <w:sz w:val="24"/>
           <w:szCs w:val="24"/>
         </w:rPr>
-        <w:t>☐</w:t>
-      </w:r>
-      <w:r>
-        <w:rPr>
-          <w:color w:val="131516"/>
-          <w:sz w:val="24"/>
-          <w:szCs w:val="24"/>
-        </w:rPr>
-        <w:t xml:space="preserve">  </w:t>
+        <w:t xml:space="preserve">☐  </w:t>
       </w:r>
       <w:r>
         <w:rPr>
@@ -1870,15 +1556,7 @@
           <w:sz w:val="24"/>
           <w:szCs w:val="24"/>
         </w:rPr>
-        <w:t>☐</w:t>
-      </w:r>
-      <w:r>
-        <w:rPr>
-          <w:color w:val="131516"/>
-          <w:sz w:val="24"/>
-          <w:szCs w:val="24"/>
-        </w:rPr>
-        <w:t xml:space="preserve">  </w:t>
+        <w:t xml:space="preserve">☐  </w:t>
       </w:r>
       <w:r>
         <w:rPr>
@@ -1914,15 +1592,7 @@
           <w:sz w:val="24"/>
           <w:szCs w:val="24"/>
         </w:rPr>
-        <w:t>☐</w:t>
-      </w:r>
-      <w:r>
-        <w:rPr>
-          <w:color w:val="131516"/>
-          <w:sz w:val="24"/>
-          <w:szCs w:val="24"/>
-        </w:rPr>
-        <w:t xml:space="preserve">  </w:t>
+        <w:t xml:space="preserve">☐  </w:t>
       </w:r>
       <w:r>
         <w:rPr>

</xml_diff>

<commit_message>
updated modules, re-ran code for greenwaste visuals
</commit_message>
<xml_diff>
--- a/Module_2_Oct_2026/Module2_task_checklist.docx
+++ b/Module_2_Oct_2026/Module2_task_checklist.docx
@@ -363,7 +363,33 @@
           <w:sz w:val="21"/>
           <w:szCs w:val="21"/>
         </w:rPr>
-        <w:t>Review wording across the materials to make it sound less like AI</w:t>
+        <w:t xml:space="preserve">Review wording across the materials to </w:t>
+      </w:r>
+      <w:r>
+        <w:rPr>
+          <w:color w:val="131516"/>
+          <w:sz w:val="21"/>
+          <w:szCs w:val="21"/>
+        </w:rPr>
+        <w:t xml:space="preserve">make sure it is clear but also not </w:t>
+      </w:r>
+      <w:r>
+        <w:rPr>
+          <w:i/>
+          <w:iCs/>
+          <w:color w:val="131516"/>
+          <w:sz w:val="21"/>
+          <w:szCs w:val="21"/>
+        </w:rPr>
+        <w:t>too</w:t>
+      </w:r>
+      <w:r>
+        <w:rPr>
+          <w:color w:val="131516"/>
+          <w:sz w:val="21"/>
+          <w:szCs w:val="21"/>
+        </w:rPr>
+        <w:t xml:space="preserve"> simple</w:t>
       </w:r>
     </w:p>
     <w:p>
@@ -400,6 +426,14 @@
           <w:szCs w:val="21"/>
         </w:rPr>
         <w:t>Are the sessions too long? What to prioritize vs cut?</w:t>
+      </w:r>
+      <w:r>
+        <w:rPr>
+          <w:color w:val="131516"/>
+          <w:sz w:val="21"/>
+          <w:szCs w:val="21"/>
+        </w:rPr>
+        <w:t xml:space="preserve"> How can we improve the formatting (should we use ppt instead of quarto)?</w:t>
       </w:r>
     </w:p>
     <w:p>
@@ -510,6 +544,32 @@
         </w:rPr>
         <w:t>Review the draft</w:t>
       </w:r>
+      <w:r>
+        <w:rPr>
+          <w:color w:val="131516"/>
+          <w:sz w:val="21"/>
+          <w:szCs w:val="21"/>
+        </w:rPr>
+        <w:t xml:space="preserve"> – need more detail and graphs to explain </w:t>
+      </w:r>
+      <w:proofErr w:type="spellStart"/>
+      <w:r>
+        <w:rPr>
+          <w:color w:val="131516"/>
+          <w:sz w:val="21"/>
+          <w:szCs w:val="21"/>
+        </w:rPr>
+        <w:t>pval</w:t>
+      </w:r>
+      <w:proofErr w:type="spellEnd"/>
+      <w:r>
+        <w:rPr>
+          <w:color w:val="131516"/>
+          <w:sz w:val="21"/>
+          <w:szCs w:val="21"/>
+        </w:rPr>
+        <w:t>, CIs, etc.</w:t>
+      </w:r>
     </w:p>
     <w:p>
       <w:pPr>
@@ -630,11 +690,11 @@
       </w:pPr>
       <w:r>
         <w:rPr>
-          <w:color w:val="131516"/>
-          <w:sz w:val="24"/>
-          <w:szCs w:val="24"/>
-        </w:rPr>
-        <w:t xml:space="preserve">☐  </w:t>
+          <w:color w:val="1E7A46"/>
+          <w:sz w:val="24"/>
+          <w:szCs w:val="24"/>
+        </w:rPr>
+        <w:t xml:space="preserve">☑  </w:t>
       </w:r>
       <w:r>
         <w:rPr>
@@ -645,7 +705,18 @@
           <w:szCs w:val="15"/>
           <w:shd w:val="clear" w:color="auto" w:fill="9A2515"/>
         </w:rPr>
-        <w:t xml:space="preserve"> FK </w:t>
+        <w:t xml:space="preserve"> </w:t>
+      </w:r>
+      <w:r>
+        <w:rPr>
+          <w:b/>
+          <w:bCs/>
+          <w:color w:val="FFFFFF"/>
+          <w:sz w:val="15"/>
+          <w:szCs w:val="15"/>
+          <w:shd w:val="clear" w:color="auto" w:fill="9A2515"/>
+        </w:rPr>
+        <w:t xml:space="preserve">FK </w:t>
       </w:r>
       <w:r>
         <w:t xml:space="preserve">  </w:t>
@@ -1228,6 +1299,7 @@
           <w:sz w:val="24"/>
           <w:szCs w:val="24"/>
         </w:rPr>
+        <w:lastRenderedPageBreak/>
         <w:t xml:space="preserve">☐  </w:t>
       </w:r>
       <w:r>
@@ -1273,7 +1345,6 @@
           <w:sz w:val="24"/>
           <w:szCs w:val="24"/>
         </w:rPr>
-        <w:lastRenderedPageBreak/>
         <w:t xml:space="preserve">☐  </w:t>
       </w:r>
       <w:r>

</xml_diff>